<commit_message>
Adding a process to add resume files to the docs folder for github pages hosting.
</commit_message>
<xml_diff>
--- a/docs/Bret Pehrson.docx
+++ b/docs/Bret Pehrson.docx
@@ -69,7 +69,7 @@
           <w:sz w:val="18"/>
           <w:szCs w:val="18"/>
         </w:rPr>
-        <w:t xml:space="preserve"> </w:t>
+        <w:t>|</w:t>
       </w:r>
       <w:r>
         <w:rPr>
@@ -77,7 +77,7 @@
           <w:sz w:val="18"/>
           <w:szCs w:val="18"/>
         </w:rPr>
-        <w:t>|</w:t>
+        <w:t xml:space="preserve"> </w:t>
       </w:r>
       <w:r>
         <w:rPr>
@@ -85,34 +85,26 @@
           <w:sz w:val="18"/>
           <w:szCs w:val="18"/>
         </w:rPr>
-        <w:t xml:space="preserve"> </w:t>
-      </w:r>
+        <w:t>github.com/</w:t>
+      </w:r>
+      <w:proofErr w:type="spellStart"/>
       <w:r>
         <w:rPr>
           <w:color w:val="1155CC"/>
           <w:sz w:val="18"/>
           <w:szCs w:val="18"/>
         </w:rPr>
-        <w:t xml:space="preserve"> </w:t>
-      </w:r>
+        <w:t>bretpdev</w:t>
+      </w:r>
+      <w:proofErr w:type="spellEnd"/>
       <w:r>
         <w:rPr>
           <w:color w:val="1155CC"/>
           <w:sz w:val="18"/>
           <w:szCs w:val="18"/>
         </w:rPr>
-        <w:t>github.com/</w:t>
-      </w:r>
-      <w:proofErr w:type="spellStart"/>
-      <w:r>
-        <w:rPr>
-          <w:color w:val="1155CC"/>
-          <w:sz w:val="18"/>
-          <w:szCs w:val="18"/>
-        </w:rPr>
-        <w:t>bretpdev</w:t>
-      </w:r>
-      <w:proofErr w:type="spellEnd"/>
+        <w:t xml:space="preserve"> | bretpehrson.com</w:t>
+      </w:r>
     </w:p>
     <w:p>
       <w:pPr>
@@ -139,6 +131,9 @@
       <w:r>
         <w:t>Senior .NET Software Developer with 17+ years of experience spanning large enterprise organizations and mission-critical systems. Proven ability to inherit complex, undocumented legacy codebases — quickly assessing, stabilizing, and incrementally modernizing them without disrupting ongoing operations. Hands-on implementer with deep expertise in C#, ASP.NET, SQL Server, IIS, and the full Microsoft stack. Currently leading a migration from a legacy WPF/WCF monolith to a modern Blazor + REST API architecture with OAuth security and Docker hosting.</w:t>
       </w:r>
+      <w:r>
+        <w:t xml:space="preserve"> Build Angular, React and Node.js sites for local small businesses.</w:t>
+      </w:r>
     </w:p>
     <w:p>
       <w:pPr>
@@ -170,7 +165,25 @@
         <w:t xml:space="preserve">Languages &amp; Frameworks: </w:t>
       </w:r>
       <w:r>
-        <w:t>C#, .NET Framework 4.x, .NET 6+, ASP.NET MVC, ASP.NET Core, Blazor, WCF, WPF, VB.NET</w:t>
+        <w:t>C#, .NET Framework 4.x, .NET</w:t>
+      </w:r>
+      <w:r>
+        <w:t xml:space="preserve"> Core</w:t>
+      </w:r>
+      <w:r>
+        <w:t>, ASP.NET MVC</w:t>
+      </w:r>
+      <w:r>
+        <w:t>,</w:t>
+      </w:r>
+      <w:r>
+        <w:t xml:space="preserve"> </w:t>
+      </w:r>
+      <w:r>
+        <w:t xml:space="preserve">Blazor, Angular, React, Node.js, Typescript, </w:t>
+      </w:r>
+      <w:r>
+        <w:t>WCF, WPF, VB.NET</w:t>
       </w:r>
       <w:r>
         <w:t>, VBA</w:t>
@@ -221,7 +234,7 @@
         <w:t xml:space="preserve">Infrastructure &amp; Tools: </w:t>
       </w:r>
       <w:r>
-        <w:t>IIS 10, Windows Server, Docker, Visual Studio 2022, GitHub, SVN, JSON</w:t>
+        <w:t>IIS 10, Windows Server, Docker, Visual Studio, GitHub, SVN, JSON</w:t>
       </w:r>
     </w:p>
     <w:p>
@@ -244,67 +257,50 @@
     </w:p>
     <w:p>
       <w:pPr>
-        <w:tabs>
-          <w:tab w:val="right" w:pos="9360"/>
-        </w:tabs>
-        <w:spacing w:before="140" w:after="20"/>
-        <w:rPr>
-          <w:b/>
-          <w:bCs/>
-          <w:sz w:val="22"/>
-          <w:szCs w:val="22"/>
-        </w:rPr>
-      </w:pPr>
-      <w:r>
-        <w:rPr>
-          <w:b/>
-          <w:bCs/>
-          <w:sz w:val="22"/>
-          <w:szCs w:val="22"/>
-        </w:rPr>
-        <w:t>Utah System of Higher Education (USHE) — Salt Lake City, UT</w:t>
-      </w:r>
-    </w:p>
-    <w:p>
-      <w:pPr>
         <w:spacing w:before="40" w:after="40"/>
-        <w:ind w:left="280"/>
-        <w:rPr>
-          <w:b/>
-          <w:bCs/>
-          <w:sz w:val="22"/>
-          <w:szCs w:val="22"/>
-        </w:rPr>
-      </w:pPr>
-      <w:r>
-        <w:rPr>
-          <w:b/>
-          <w:bCs/>
-          <w:sz w:val="22"/>
-          <w:szCs w:val="22"/>
-        </w:rPr>
-        <w:t>Software Developer IV (Senior Level) — University of Utah UIT / Northstar Team</w:t>
-      </w:r>
-      <w:r>
-        <w:rPr>
-          <w:b/>
-          <w:bCs/>
-          <w:sz w:val="22"/>
-          <w:szCs w:val="22"/>
-        </w:rPr>
-        <w:t xml:space="preserve"> (</w:t>
-      </w:r>
-      <w:proofErr w:type="spellStart"/>
-      <w:r>
-        <w:rPr>
-          <w:b/>
-          <w:bCs/>
-          <w:sz w:val="22"/>
-          <w:szCs w:val="22"/>
-        </w:rPr>
-        <w:t>UTech</w:t>
-      </w:r>
-      <w:proofErr w:type="spellEnd"/>
+        <w:rPr>
+          <w:b/>
+          <w:bCs/>
+          <w:sz w:val="22"/>
+          <w:szCs w:val="22"/>
+        </w:rPr>
+      </w:pPr>
+      <w:r>
+        <w:rPr>
+          <w:b/>
+          <w:bCs/>
+          <w:sz w:val="22"/>
+          <w:szCs w:val="22"/>
+        </w:rPr>
+        <w:t>U</w:t>
+      </w:r>
+      <w:r>
+        <w:rPr>
+          <w:b/>
+          <w:bCs/>
+          <w:sz w:val="22"/>
+          <w:szCs w:val="22"/>
+        </w:rPr>
+        <w:t xml:space="preserve">niversity of Utah </w:t>
+      </w:r>
+      <w:r>
+        <w:rPr>
+          <w:b/>
+          <w:bCs/>
+          <w:sz w:val="22"/>
+          <w:szCs w:val="22"/>
+        </w:rPr>
+        <w:t>(</w:t>
+      </w:r>
+      <w:r>
+        <w:rPr>
+          <w:b/>
+          <w:bCs/>
+          <w:sz w:val="22"/>
+          <w:szCs w:val="22"/>
+        </w:rPr>
+        <w:t>UIT</w:t>
+      </w:r>
       <w:r>
         <w:rPr>
           <w:b/>
@@ -318,12 +314,75 @@
     <w:p>
       <w:pPr>
         <w:spacing w:before="40" w:after="40"/>
-        <w:ind w:left="280"/>
         <w:rPr>
           <w:sz w:val="21"/>
           <w:szCs w:val="21"/>
         </w:rPr>
       </w:pPr>
+      <w:r>
+        <w:rPr>
+          <w:b/>
+          <w:bCs/>
+          <w:sz w:val="22"/>
+          <w:szCs w:val="22"/>
+        </w:rPr>
+        <w:t>Software Developer IV (Senior Level)</w:t>
+      </w:r>
+      <w:r>
+        <w:rPr>
+          <w:b/>
+          <w:bCs/>
+          <w:sz w:val="22"/>
+          <w:szCs w:val="22"/>
+        </w:rPr>
+        <w:tab/>
+      </w:r>
+      <w:r>
+        <w:rPr>
+          <w:b/>
+          <w:bCs/>
+          <w:sz w:val="22"/>
+          <w:szCs w:val="22"/>
+        </w:rPr>
+        <w:tab/>
+      </w:r>
+      <w:r>
+        <w:rPr>
+          <w:b/>
+          <w:bCs/>
+          <w:sz w:val="22"/>
+          <w:szCs w:val="22"/>
+        </w:rPr>
+        <w:tab/>
+      </w:r>
+      <w:r>
+        <w:rPr>
+          <w:b/>
+          <w:bCs/>
+          <w:sz w:val="22"/>
+          <w:szCs w:val="22"/>
+        </w:rPr>
+        <w:tab/>
+      </w:r>
+      <w:r>
+        <w:rPr>
+          <w:b/>
+          <w:bCs/>
+          <w:sz w:val="22"/>
+          <w:szCs w:val="22"/>
+        </w:rPr>
+        <w:tab/>
+      </w:r>
+      <w:r>
+        <w:rPr>
+          <w:b/>
+          <w:bCs/>
+          <w:sz w:val="22"/>
+          <w:szCs w:val="22"/>
+        </w:rPr>
+        <w:tab/>
+        <w:t xml:space="preserve"> </w:t>
+      </w:r>
       <w:r>
         <w:rPr>
           <w:sz w:val="21"/>
@@ -399,39 +458,110 @@
     </w:p>
     <w:p>
       <w:pPr>
+        <w:spacing w:before="40" w:after="40"/>
+      </w:pPr>
+    </w:p>
+    <w:p>
+      <w:pPr>
+        <w:spacing w:before="40" w:after="40"/>
+      </w:pPr>
+      <w:r>
+        <w:rPr>
+          <w:b/>
+          <w:bCs/>
+          <w:sz w:val="22"/>
+          <w:szCs w:val="22"/>
+        </w:rPr>
+        <w:t>Utah Higher Education Assistance Authority (UHEAA)</w:t>
+      </w:r>
+    </w:p>
+    <w:p>
+      <w:pPr>
         <w:pStyle w:val="ListParagraph"/>
         <w:spacing w:before="40" w:after="40"/>
-        <w:ind w:left="540"/>
-      </w:pPr>
-    </w:p>
-    <w:p>
-      <w:pPr>
-        <w:pStyle w:val="ListParagraph"/>
-        <w:spacing w:before="40" w:after="40"/>
-        <w:ind w:left="280"/>
-        <w:rPr>
-          <w:b/>
-          <w:bCs/>
-          <w:sz w:val="22"/>
-          <w:szCs w:val="22"/>
-        </w:rPr>
-      </w:pPr>
-      <w:r>
-        <w:rPr>
-          <w:b/>
-          <w:bCs/>
-          <w:sz w:val="22"/>
-          <w:szCs w:val="22"/>
-        </w:rPr>
-        <w:t>Software Developer II — Utah Higher Education Assistance Authority (UHEAA)</w:t>
-      </w:r>
-    </w:p>
-    <w:p>
-      <w:pPr>
-        <w:pStyle w:val="ListParagraph"/>
-        <w:spacing w:before="40" w:after="40"/>
-        <w:ind w:left="280"/>
-      </w:pPr>
+      </w:pPr>
+      <w:r>
+        <w:rPr>
+          <w:b/>
+          <w:bCs/>
+          <w:sz w:val="22"/>
+          <w:szCs w:val="22"/>
+        </w:rPr>
+        <w:t>Software Developer II</w:t>
+      </w:r>
+      <w:r>
+        <w:rPr>
+          <w:b/>
+          <w:bCs/>
+          <w:sz w:val="22"/>
+          <w:szCs w:val="22"/>
+        </w:rPr>
+        <w:tab/>
+      </w:r>
+      <w:r>
+        <w:rPr>
+          <w:b/>
+          <w:bCs/>
+          <w:sz w:val="22"/>
+          <w:szCs w:val="22"/>
+        </w:rPr>
+        <w:tab/>
+      </w:r>
+      <w:r>
+        <w:rPr>
+          <w:b/>
+          <w:bCs/>
+          <w:sz w:val="22"/>
+          <w:szCs w:val="22"/>
+        </w:rPr>
+        <w:tab/>
+      </w:r>
+      <w:r>
+        <w:rPr>
+          <w:b/>
+          <w:bCs/>
+          <w:sz w:val="22"/>
+          <w:szCs w:val="22"/>
+        </w:rPr>
+        <w:tab/>
+      </w:r>
+      <w:r>
+        <w:rPr>
+          <w:b/>
+          <w:bCs/>
+          <w:sz w:val="22"/>
+          <w:szCs w:val="22"/>
+        </w:rPr>
+        <w:tab/>
+      </w:r>
+      <w:r>
+        <w:rPr>
+          <w:b/>
+          <w:bCs/>
+          <w:sz w:val="22"/>
+          <w:szCs w:val="22"/>
+        </w:rPr>
+        <w:tab/>
+      </w:r>
+      <w:r>
+        <w:rPr>
+          <w:b/>
+          <w:bCs/>
+          <w:sz w:val="22"/>
+          <w:szCs w:val="22"/>
+        </w:rPr>
+        <w:tab/>
+      </w:r>
+      <w:r>
+        <w:rPr>
+          <w:b/>
+          <w:bCs/>
+          <w:sz w:val="22"/>
+          <w:szCs w:val="22"/>
+        </w:rPr>
+        <w:tab/>
+        <w:t xml:space="preserve">  </w:t>
+      </w:r>
       <w:r>
         <w:t>10/2008 – 12/2020</w:t>
       </w:r>
@@ -576,10 +706,7 @@
         <w:spacing w:after="80"/>
       </w:pPr>
       <w:r>
-        <w:t xml:space="preserve">    </w:t>
-      </w:r>
-      <w:r>
-        <w:t>B.S. Computer Science  |  GPA: 3.1</w:t>
+        <w:t xml:space="preserve">    B.S. Computer Science</w:t>
       </w:r>
       <w:r>
         <w:rPr>
@@ -621,10 +748,7 @@
         <w:spacing w:after="80"/>
       </w:pPr>
       <w:r>
-        <w:t xml:space="preserve">    </w:t>
-      </w:r>
-      <w:r>
-        <w:t>A.A.S. Mathematics Education  |  GPA: 3.2</w:t>
+        <w:t xml:space="preserve">    A.A.S. Mathematics Education</w:t>
       </w:r>
       <w:r>
         <w:rPr>

</xml_diff>

<commit_message>
Giving a version to the resume so the browser does not cache the existing files.
</commit_message>
<xml_diff>
--- a/docs/Bret Pehrson.docx
+++ b/docs/Bret Pehrson.docx
@@ -1,6 +1,6 @@
 
 <file path=word/document.xml><?xml version="1.0" encoding="utf-8"?>
-<w:document xmlns:wpc="http://schemas.microsoft.com/office/word/2010/wordprocessingCanvas" xmlns:cx="http://schemas.microsoft.com/office/drawing/2014/chartex" xmlns:cx1="http://schemas.microsoft.com/office/drawing/2015/9/8/chartex" xmlns:cx2="http://schemas.microsoft.com/office/drawing/2015/10/21/chartex" xmlns:cx3="http://schemas.microsoft.com/office/drawing/2016/5/9/chartex" xmlns:cx4="http://schemas.microsoft.com/office/drawing/2016/5/10/chartex" xmlns:cx5="http://schemas.microsoft.com/office/drawing/2016/5/11/chartex" xmlns:cx6="http://schemas.microsoft.com/office/drawing/2016/5/12/chartex" xmlns:cx7="http://schemas.microsoft.com/office/drawing/2016/5/13/chartex" xmlns:cx8="http://schemas.microsoft.com/office/drawing/2016/5/14/chartex" xmlns:mc="http://schemas.openxmlformats.org/markup-compatibility/2006" xmlns:aink="http://schemas.microsoft.com/office/drawing/2016/ink" xmlns:am3d="http://schemas.microsoft.com/office/drawing/2017/model3d" xmlns:o="urn:schemas-microsoft-com:office:office" xmlns:oel="http://schemas.microsoft.com/office/2019/extlst" xmlns:r="http://schemas.openxmlformats.org/officeDocument/2006/relationships" xmlns:m="http://schemas.openxmlformats.org/officeDocument/2006/math" xmlns:v="urn:schemas-microsoft-com:vml" xmlns:wp14="http://schemas.microsoft.com/office/word/2010/wordprocessingDrawing" xmlns:wp="http://schemas.openxmlformats.org/drawingml/2006/wordprocessingDrawing" xmlns:w10="urn:schemas-microsoft-com:office:word" xmlns:w="http://schemas.openxmlformats.org/wordprocessingml/2006/main" xmlns:w14="http://schemas.microsoft.com/office/word/2010/wordml" xmlns:w15="http://schemas.microsoft.com/office/word/2012/wordml" xmlns:w16cex="http://schemas.microsoft.com/office/word/2018/wordml/cex" xmlns:w16cid="http://schemas.microsoft.com/office/word/2016/wordml/cid" xmlns:w16="http://schemas.microsoft.com/office/word/2018/wordml" xmlns:w16du="http://schemas.microsoft.com/office/word/2023/wordml/word16du" xmlns:w16sdtdh="http://schemas.microsoft.com/office/word/2020/wordml/sdtdatahash" xmlns:w16sdtfl="http://schemas.microsoft.com/office/word/2024/wordml/sdtformatlock" xmlns:w16se="http://schemas.microsoft.com/office/word/2015/wordml/symex" xmlns:wpg="http://schemas.microsoft.com/office/word/2010/wordprocessingGroup" xmlns:wpi="http://schemas.microsoft.com/office/word/2010/wordprocessingInk" xmlns:wne="http://schemas.microsoft.com/office/word/2006/wordml" xmlns:wps="http://schemas.microsoft.com/office/word/2010/wordprocessingShape" mc:Ignorable="w14 w15 w16se w16cid w16 w16cex w16sdtdh w16sdtfl w16du wp14">
+<w:document xmlns:wpc="http://schemas.microsoft.com/office/word/2010/wordprocessingCanvas" xmlns:cx="http://schemas.microsoft.com/office/drawing/2014/chartex" xmlns:cx1="http://schemas.microsoft.com/office/drawing/2015/9/8/chartex" xmlns:cx2="http://schemas.microsoft.com/office/drawing/2015/10/21/chartex" xmlns:cx3="http://schemas.microsoft.com/office/drawing/2016/5/9/chartex" xmlns:cx4="http://schemas.microsoft.com/office/drawing/2016/5/10/chartex" xmlns:cx5="http://schemas.microsoft.com/office/drawing/2016/5/11/chartex" xmlns:cx6="http://schemas.microsoft.com/office/drawing/2016/5/12/chartex" xmlns:cx7="http://schemas.microsoft.com/office/drawing/2016/5/13/chartex" xmlns:cx8="http://schemas.microsoft.com/office/drawing/2016/5/14/chartex" xmlns:mc="http://schemas.openxmlformats.org/markup-compatibility/2006" xmlns:m="http://schemas.openxmlformats.org/officeDocument/2006/math" xmlns:aink="http://schemas.microsoft.com/office/drawing/2016/ink" xmlns:am3d="http://schemas.microsoft.com/office/drawing/2017/model3d" xmlns:oel="http://schemas.microsoft.com/office/2019/extlst" xmlns:r="http://schemas.openxmlformats.org/officeDocument/2006/relationships" xmlns:wp14="http://schemas.microsoft.com/office/word/2010/wordprocessingDrawing" xmlns:wp="http://schemas.openxmlformats.org/drawingml/2006/wordprocessingDrawing" xmlns:wpg="http://schemas.microsoft.com/office/word/2010/wordprocessingGroup" xmlns:wpi="http://schemas.microsoft.com/office/word/2010/wordprocessingInk" xmlns:wps="http://schemas.microsoft.com/office/word/2010/wordprocessingShape" xmlns:o="urn:schemas-microsoft-com:office:office" xmlns:v="urn:schemas-microsoft-com:vml" xmlns:w10="urn:schemas-microsoft-com:office:word" xmlns:w="http://schemas.openxmlformats.org/wordprocessingml/2006/main" xmlns:w14="http://schemas.microsoft.com/office/word/2010/wordml" xmlns:w15="http://schemas.microsoft.com/office/word/2012/wordml" xmlns:w16cex="http://schemas.microsoft.com/office/word/2018/wordml/cex" xmlns:w16cid="http://schemas.microsoft.com/office/word/2016/wordml/cid" xmlns:w16="http://schemas.microsoft.com/office/word/2018/wordml" xmlns:w16sdtdh="http://schemas.microsoft.com/office/word/2020/wordml/sdtdatahash" xmlns:w16sdtfl="http://schemas.microsoft.com/office/word/2024/wordml/sdtformatlock" xmlns:w16se="http://schemas.microsoft.com/office/word/2015/wordml/symex" xmlns:w16du="http://schemas.microsoft.com/office/word/2023/wordml/word16du" xmlns:wne="http://schemas.microsoft.com/office/word/2006/wordml" mc:Ignorable="w14 w15 w16se w16cid w16 w16cex w16sdtdh w16sdtfl w16du wp14">
   <w:body>
     <w:p>
       <w:pPr>
@@ -22,14 +22,81 @@
       <w:pPr>
         <w:spacing w:after="40"/>
         <w:jc w:val="center"/>
-      </w:pPr>
-      <w:r>
         <w:rPr>
           <w:color w:val="444444"/>
           <w:sz w:val="22"/>
           <w:szCs w:val="22"/>
         </w:rPr>
+      </w:pPr>
+      <w:r>
+        <w:rPr>
+          <w:color w:val="444444"/>
+          <w:sz w:val="22"/>
+          <w:szCs w:val="22"/>
+        </w:rPr>
         <w:t>Senior .NET Software Developer</w:t>
+      </w:r>
+    </w:p>
+    <w:p>
+      <w:pPr>
+        <w:spacing w:after="40"/>
+        <w:jc w:val="center"/>
+      </w:pPr>
+      <w:r>
+        <w:rPr>
+          <w:color w:val="444444"/>
+          <w:sz w:val="22"/>
+          <w:szCs w:val="22"/>
+        </w:rPr>
+        <w:t>35 E 100 S #303, S</w:t>
+      </w:r>
+      <w:r>
+        <w:rPr>
+          <w:color w:val="444444"/>
+          <w:sz w:val="22"/>
+          <w:szCs w:val="22"/>
+        </w:rPr>
+        <w:t xml:space="preserve">alt </w:t>
+      </w:r>
+      <w:r>
+        <w:rPr>
+          <w:color w:val="444444"/>
+          <w:sz w:val="22"/>
+          <w:szCs w:val="22"/>
+        </w:rPr>
+        <w:t>L</w:t>
+      </w:r>
+      <w:r>
+        <w:rPr>
+          <w:color w:val="444444"/>
+          <w:sz w:val="22"/>
+          <w:szCs w:val="22"/>
+        </w:rPr>
+        <w:t xml:space="preserve">ake </w:t>
+      </w:r>
+      <w:r>
+        <w:rPr>
+          <w:color w:val="444444"/>
+          <w:sz w:val="22"/>
+          <w:szCs w:val="22"/>
+        </w:rPr>
+        <w:t>C</w:t>
+      </w:r>
+      <w:r>
+        <w:rPr>
+          <w:color w:val="444444"/>
+          <w:sz w:val="22"/>
+          <w:szCs w:val="22"/>
+        </w:rPr>
+        <w:t>ity</w:t>
+      </w:r>
+      <w:r>
+        <w:rPr>
+          <w:color w:val="444444"/>
+          <w:sz w:val="22"/>
+          <w:szCs w:val="22"/>
+        </w:rPr>
+        <w:t>, UT. 84111 | 801-921-8125</w:t>
       </w:r>
     </w:p>
     <w:p>
@@ -85,7 +152,7 @@
           <w:sz w:val="18"/>
           <w:szCs w:val="18"/>
         </w:rPr>
-        <w:t>github.com/</w:t>
+        <w:t>github.c</w:t>
       </w:r>
       <w:proofErr w:type="spellStart"/>
       <w:r>
@@ -94,9 +161,25 @@
           <w:sz w:val="18"/>
           <w:szCs w:val="18"/>
         </w:rPr>
-        <w:t>bretpdev</w:t>
+        <w:t>om/bretp</w:t>
+      </w:r>
+      <w:r>
+        <w:rPr>
+          <w:color w:val="1155CC"/>
+          <w:sz w:val="18"/>
+          <w:szCs w:val="18"/>
+        </w:rPr>
+        <w:t>ehr</w:t>
       </w:r>
       <w:proofErr w:type="spellEnd"/>
+      <w:r>
+        <w:rPr>
+          <w:color w:val="1155CC"/>
+          <w:sz w:val="18"/>
+          <w:szCs w:val="18"/>
+        </w:rPr>
+        <w:t>son</w:t>
+      </w:r>
       <w:r>
         <w:rPr>
           <w:color w:val="1155CC"/>
@@ -125,14 +208,40 @@
       </w:r>
     </w:p>
     <w:p>
-      <w:pPr>
-        <w:spacing w:before="80" w:after="80"/>
-      </w:pPr>
-      <w:r>
-        <w:t>Senior .NET Software Developer with 17+ years of experience spanning large enterprise organizations and mission-critical systems. Proven ability to inherit complex, undocumented legacy codebases — quickly assessing, stabilizing, and incrementally modernizing them without disrupting ongoing operations. Hands-on implementer with deep expertise in C#, ASP.NET, SQL Server, IIS, and the full Microsoft stack. Currently leading a migration from a legacy WPF/WCF monolith to a modern Blazor + REST API architecture with OAuth security and Docker hosting.</w:t>
-      </w:r>
-      <w:r>
-        <w:t xml:space="preserve"> Build Angular, React and Node.js sites for local small businesses.</w:t>
+      <w:r>
+        <w:rPr>
+          <w:rFonts w:eastAsia="Times New Roman"/>
+          <w:color w:val="auto"/>
+        </w:rPr>
+        <w:t>Senior .NET Software Developer with 17+ years of experience spanning large enterprise organizations and mission-critical systems. Proven ability to inherit complex, undocumented legacy codebases — quickly assessing, stabilizing, and incrementally modernizing them without disrupting ongoing operations. Hands-on implementer with deep expertise in C#, ASP.NET, SQL Server, IIS, and the full Microsoft stack. Most recently, assisted a migration from a legacy WPF/WCF monolith to a modern Blazor + REST API architecture with OAuth security and Docker hosting. Build Angular, React</w:t>
+      </w:r>
+      <w:r>
+        <w:rPr>
+          <w:rFonts w:eastAsia="Times New Roman"/>
+          <w:color w:val="auto"/>
+        </w:rPr>
+        <w:t>/</w:t>
+      </w:r>
+      <w:r>
+        <w:rPr>
+          <w:rFonts w:eastAsia="Times New Roman"/>
+          <w:color w:val="auto"/>
+        </w:rPr>
+        <w:t>N</w:t>
+      </w:r>
+      <w:r>
+        <w:rPr>
+          <w:rFonts w:eastAsia="Times New Roman"/>
+          <w:color w:val="auto"/>
+        </w:rPr>
+        <w:t>ext</w:t>
+      </w:r>
+      <w:r>
+        <w:rPr>
+          <w:rFonts w:eastAsia="Times New Roman"/>
+          <w:color w:val="auto"/>
+        </w:rPr>
+        <w:t>.js sites for local small businesses.</w:t>
       </w:r>
     </w:p>
     <w:p>
@@ -180,7 +289,13 @@
         <w:t xml:space="preserve"> </w:t>
       </w:r>
       <w:r>
-        <w:t xml:space="preserve">Blazor, Angular, React, Node.js, Typescript, </w:t>
+        <w:t>Blazor, Angular, React, N</w:t>
+      </w:r>
+      <w:r>
+        <w:t>ext</w:t>
+      </w:r>
+      <w:r>
+        <w:t xml:space="preserve">.js, Typescript, </w:t>
       </w:r>
       <w:r>
         <w:t>WCF, WPF, VB.NET</w:t>
@@ -381,14 +496,20 @@
           <w:szCs w:val="22"/>
         </w:rPr>
         <w:tab/>
-        <w:t xml:space="preserve"> </w:t>
       </w:r>
       <w:r>
         <w:rPr>
           <w:sz w:val="21"/>
           <w:szCs w:val="21"/>
         </w:rPr>
-        <w:t>02/2021 – Present</w:t>
+        <w:t xml:space="preserve">02/2021 – </w:t>
+      </w:r>
+      <w:r>
+        <w:rPr>
+          <w:sz w:val="21"/>
+          <w:szCs w:val="21"/>
+        </w:rPr>
+        <w:t>06/2026</w:t>
       </w:r>
     </w:p>
     <w:p>
@@ -769,7 +890,7 @@
 </file>
 
 <file path=word/numbering.xml><?xml version="1.0" encoding="utf-8"?>
-<w:numbering xmlns:wpc="http://schemas.microsoft.com/office/word/2010/wordprocessingCanvas" xmlns:cx="http://schemas.microsoft.com/office/drawing/2014/chartex" xmlns:cx1="http://schemas.microsoft.com/office/drawing/2015/9/8/chartex" xmlns:cx2="http://schemas.microsoft.com/office/drawing/2015/10/21/chartex" xmlns:cx3="http://schemas.microsoft.com/office/drawing/2016/5/9/chartex" xmlns:cx4="http://schemas.microsoft.com/office/drawing/2016/5/10/chartex" xmlns:cx5="http://schemas.microsoft.com/office/drawing/2016/5/11/chartex" xmlns:cx6="http://schemas.microsoft.com/office/drawing/2016/5/12/chartex" xmlns:cx7="http://schemas.microsoft.com/office/drawing/2016/5/13/chartex" xmlns:cx8="http://schemas.microsoft.com/office/drawing/2016/5/14/chartex" xmlns:mc="http://schemas.openxmlformats.org/markup-compatibility/2006" xmlns:aink="http://schemas.microsoft.com/office/drawing/2016/ink" xmlns:am3d="http://schemas.microsoft.com/office/drawing/2017/model3d" xmlns:o="urn:schemas-microsoft-com:office:office" xmlns:oel="http://schemas.microsoft.com/office/2019/extlst" xmlns:r="http://schemas.openxmlformats.org/officeDocument/2006/relationships" xmlns:m="http://schemas.openxmlformats.org/officeDocument/2006/math" xmlns:v="urn:schemas-microsoft-com:vml" xmlns:wp14="http://schemas.microsoft.com/office/word/2010/wordprocessingDrawing" xmlns:wp="http://schemas.openxmlformats.org/drawingml/2006/wordprocessingDrawing" xmlns:w10="urn:schemas-microsoft-com:office:word" xmlns:w="http://schemas.openxmlformats.org/wordprocessingml/2006/main" xmlns:w14="http://schemas.microsoft.com/office/word/2010/wordml" xmlns:w15="http://schemas.microsoft.com/office/word/2012/wordml" xmlns:w16cex="http://schemas.microsoft.com/office/word/2018/wordml/cex" xmlns:w16cid="http://schemas.microsoft.com/office/word/2016/wordml/cid" xmlns:w16="http://schemas.microsoft.com/office/word/2018/wordml" xmlns:w16du="http://schemas.microsoft.com/office/word/2023/wordml/word16du" xmlns:w16sdtdh="http://schemas.microsoft.com/office/word/2020/wordml/sdtdatahash" xmlns:w16sdtfl="http://schemas.microsoft.com/office/word/2024/wordml/sdtformatlock" xmlns:w16se="http://schemas.microsoft.com/office/word/2015/wordml/symex" xmlns:wpg="http://schemas.microsoft.com/office/word/2010/wordprocessingGroup" xmlns:wpi="http://schemas.microsoft.com/office/word/2010/wordprocessingInk" xmlns:wne="http://schemas.microsoft.com/office/word/2006/wordml" xmlns:wps="http://schemas.microsoft.com/office/word/2010/wordprocessingShape" mc:Ignorable="w14 w15 w16se w16cid w16 w16cex w16sdtdh w16sdtfl w16du wp14">
+<w:numbering xmlns:wpc="http://schemas.microsoft.com/office/word/2010/wordprocessingCanvas" xmlns:cx="http://schemas.microsoft.com/office/drawing/2014/chartex" xmlns:cx1="http://schemas.microsoft.com/office/drawing/2015/9/8/chartex" xmlns:cx2="http://schemas.microsoft.com/office/drawing/2015/10/21/chartex" xmlns:cx3="http://schemas.microsoft.com/office/drawing/2016/5/9/chartex" xmlns:cx4="http://schemas.microsoft.com/office/drawing/2016/5/10/chartex" xmlns:cx5="http://schemas.microsoft.com/office/drawing/2016/5/11/chartex" xmlns:cx6="http://schemas.microsoft.com/office/drawing/2016/5/12/chartex" xmlns:cx7="http://schemas.microsoft.com/office/drawing/2016/5/13/chartex" xmlns:cx8="http://schemas.microsoft.com/office/drawing/2016/5/14/chartex" xmlns:mc="http://schemas.openxmlformats.org/markup-compatibility/2006" xmlns:m="http://schemas.openxmlformats.org/officeDocument/2006/math" xmlns:aink="http://schemas.microsoft.com/office/drawing/2016/ink" xmlns:am3d="http://schemas.microsoft.com/office/drawing/2017/model3d" xmlns:oel="http://schemas.microsoft.com/office/2019/extlst" xmlns:r="http://schemas.openxmlformats.org/officeDocument/2006/relationships" xmlns:wp14="http://schemas.microsoft.com/office/word/2010/wordprocessingDrawing" xmlns:wp="http://schemas.openxmlformats.org/drawingml/2006/wordprocessingDrawing" xmlns:wpg="http://schemas.microsoft.com/office/word/2010/wordprocessingGroup" xmlns:wpi="http://schemas.microsoft.com/office/word/2010/wordprocessingInk" xmlns:wps="http://schemas.microsoft.com/office/word/2010/wordprocessingShape" xmlns:o="urn:schemas-microsoft-com:office:office" xmlns:v="urn:schemas-microsoft-com:vml" xmlns:w10="urn:schemas-microsoft-com:office:word" xmlns:w="http://schemas.openxmlformats.org/wordprocessingml/2006/main" xmlns:w14="http://schemas.microsoft.com/office/word/2010/wordml" xmlns:w15="http://schemas.microsoft.com/office/word/2012/wordml" xmlns:w16cex="http://schemas.microsoft.com/office/word/2018/wordml/cex" xmlns:w16cid="http://schemas.microsoft.com/office/word/2016/wordml/cid" xmlns:w16="http://schemas.microsoft.com/office/word/2018/wordml" xmlns:w16sdtdh="http://schemas.microsoft.com/office/word/2020/wordml/sdtdatahash" xmlns:w16sdtfl="http://schemas.microsoft.com/office/word/2024/wordml/sdtformatlock" xmlns:w16se="http://schemas.microsoft.com/office/word/2015/wordml/symex" xmlns:w16du="http://schemas.microsoft.com/office/word/2023/wordml/word16du" xmlns:wne="http://schemas.microsoft.com/office/word/2006/wordml" mc:Ignorable="w14 w15 w16se w16cid w16 w16cex w16sdtdh w16sdtfl w16du wp14">
   <w:abstractNum w:abstractNumId="0" w15:restartNumberingAfterBreak="0">
     <w:nsid w:val="0E4D4303"/>
     <w:multiLevelType w:val="hybridMultilevel"/>
@@ -929,7 +1050,7 @@
 </file>
 
 <file path=word/styles.xml><?xml version="1.0" encoding="utf-8"?>
-<w:styles xmlns:mc="http://schemas.openxmlformats.org/markup-compatibility/2006" xmlns:r="http://schemas.openxmlformats.org/officeDocument/2006/relationships" xmlns:w="http://schemas.openxmlformats.org/wordprocessingml/2006/main" xmlns:w14="http://schemas.microsoft.com/office/word/2010/wordml" xmlns:w15="http://schemas.microsoft.com/office/word/2012/wordml" xmlns:w16cex="http://schemas.microsoft.com/office/word/2018/wordml/cex" xmlns:w16cid="http://schemas.microsoft.com/office/word/2016/wordml/cid" xmlns:w16="http://schemas.microsoft.com/office/word/2018/wordml" xmlns:w16du="http://schemas.microsoft.com/office/word/2023/wordml/word16du" xmlns:w16sdtdh="http://schemas.microsoft.com/office/word/2020/wordml/sdtdatahash" xmlns:w16sdtfl="http://schemas.microsoft.com/office/word/2024/wordml/sdtformatlock" xmlns:w16se="http://schemas.microsoft.com/office/word/2015/wordml/symex" mc:Ignorable="w14 w15 w16se w16cid w16 w16cex w16sdtdh w16sdtfl w16du">
+<w:styles xmlns:mc="http://schemas.openxmlformats.org/markup-compatibility/2006" xmlns:r="http://schemas.openxmlformats.org/officeDocument/2006/relationships" xmlns:w="http://schemas.openxmlformats.org/wordprocessingml/2006/main" xmlns:w14="http://schemas.microsoft.com/office/word/2010/wordml" xmlns:w15="http://schemas.microsoft.com/office/word/2012/wordml" xmlns:w16cex="http://schemas.microsoft.com/office/word/2018/wordml/cex" xmlns:w16cid="http://schemas.microsoft.com/office/word/2016/wordml/cid" xmlns:w16="http://schemas.microsoft.com/office/word/2018/wordml" xmlns:w16sdtdh="http://schemas.microsoft.com/office/word/2020/wordml/sdtdatahash" xmlns:w16sdtfl="http://schemas.microsoft.com/office/word/2024/wordml/sdtformatlock" xmlns:w16se="http://schemas.microsoft.com/office/word/2015/wordml/symex" xmlns:w16du="http://schemas.microsoft.com/office/word/2023/wordml/word16du" mc:Ignorable="w14 w15 w16se w16cid w16 w16cex w16sdtdh w16sdtfl w16du">
   <w:docDefaults>
     <w:rPrDefault>
       <w:rPr>

</xml_diff>